<commit_message>
add finished mongodb notes
</commit_message>
<xml_diff>
--- a/AWS/Cognito/Notes.docx
+++ b/AWS/Cognito/Notes.docx
@@ -1,10 +1,24 @@
 
 <file path=word/document.xml><?xml version="1.0" encoding="utf-8"?>
-<w:document xmlns:wpc="http://schemas.microsoft.com/office/word/2010/wordprocessingCanvas" xmlns:cx="http://schemas.microsoft.com/office/drawing/2014/chartex" xmlns:cx1="http://schemas.microsoft.com/office/drawing/2015/9/8/chartex" xmlns:cx2="http://schemas.microsoft.com/office/drawing/2015/10/21/chartex" xmlns:cx3="http://schemas.microsoft.com/office/drawing/2016/5/9/chartex" xmlns:cx4="http://schemas.microsoft.com/office/drawing/2016/5/10/chartex" xmlns:cx5="http://schemas.microsoft.com/office/drawing/2016/5/11/chartex" xmlns:cx6="http://schemas.microsoft.com/office/drawing/2016/5/12/chartex" xmlns:cx7="http://schemas.microsoft.com/office/drawing/2016/5/13/chartex" xmlns:cx8="http://schemas.microsoft.com/office/drawing/2016/5/14/chartex" xmlns:mc="http://schemas.openxmlformats.org/markup-compatibility/2006" xmlns:aink="http://schemas.microsoft.com/office/drawing/2016/ink" xmlns:am3d="http://schemas.microsoft.com/office/drawing/2017/model3d" xmlns:o="urn:schemas-microsoft-com:office:office" xmlns:oel="http://schemas.microsoft.com/office/2019/extlst" xmlns:r="http://schemas.openxmlformats.org/officeDocument/2006/relationships" xmlns:m="http://schemas.openxmlformats.org/officeDocument/2006/math" xmlns:v="urn:schemas-microsoft-com:vml" xmlns:wp14="http://schemas.microsoft.com/office/word/2010/wordprocessingDrawing" xmlns:wp="http://schemas.openxmlformats.org/drawingml/2006/wordprocessingDrawing" xmlns:w10="urn:schemas-microsoft-com:office:word" xmlns:w="http://schemas.openxmlformats.org/wordprocessingml/2006/main" xmlns:w14="http://schemas.microsoft.com/office/word/2010/wordml" xmlns:w15="http://schemas.microsoft.com/office/word/2012/wordml" xmlns:w16cei="http://schemas.microsoft.com/office/word/2026/wordml/cei" xmlns:w16cex="http://schemas.microsoft.com/office/word/2018/wordml/cex" xmlns:w16cid="http://schemas.microsoft.com/office/word/2016/wordml/cid" xmlns:w16="http://schemas.microsoft.com/office/word/2018/wordml" xmlns:w16du="http://schemas.microsoft.com/office/word/2023/wordml/word16du" xmlns:w16sdtdh="http://schemas.microsoft.com/office/word/2020/wordml/sdtdatahash" xmlns:w16sdtfl="http://schemas.microsoft.com/office/word/2024/wordml/sdtformatlock" xmlns:w16se="http://schemas.microsoft.com/office/word/2015/wordml/symex" xmlns:wpg="http://schemas.microsoft.com/office/word/2010/wordprocessingGroup" xmlns:wpi="http://schemas.microsoft.com/office/word/2010/wordprocessingInk" xmlns:wne="http://schemas.microsoft.com/office/word/2006/wordml" xmlns:wps="http://schemas.microsoft.com/office/word/2010/wordprocessingShape" mc:Ignorable="w14 w15 w16se w16cid w16 w16cex w16sdtdh w16sdtfl w16du wp14">
+<w:document xmlns:wpc="http://schemas.microsoft.com/office/word/2010/wordprocessingCanvas" xmlns:cx="http://schemas.microsoft.com/office/drawing/2014/chartex" xmlns:cx1="http://schemas.microsoft.com/office/drawing/2015/9/8/chartex" xmlns:cx2="http://schemas.microsoft.com/office/drawing/2015/10/21/chartex" xmlns:cx3="http://schemas.microsoft.com/office/drawing/2016/5/9/chartex" xmlns:cx4="http://schemas.microsoft.com/office/drawing/2016/5/10/chartex" xmlns:cx5="http://schemas.microsoft.com/office/drawing/2016/5/11/chartex" xmlns:cx6="http://schemas.microsoft.com/office/drawing/2016/5/12/chartex" xmlns:cx7="http://schemas.microsoft.com/office/drawing/2016/5/13/chartex" xmlns:cx8="http://schemas.microsoft.com/office/drawing/2016/5/14/chartex" xmlns:mc="http://schemas.openxmlformats.org/markup-compatibility/2006" xmlns:aink="http://schemas.microsoft.com/office/drawing/2016/ink" xmlns:am3d="http://schemas.microsoft.com/office/drawing/2017/model3d" xmlns:o="urn:schemas-microsoft-com:office:office" xmlns:oel="http://schemas.microsoft.com/office/2019/extlst" xmlns:r="http://schemas.openxmlformats.org/officeDocument/2006/relationships" xmlns:m="http://schemas.openxmlformats.org/officeDocument/2006/math" xmlns:v="urn:schemas-microsoft-com:vml" xmlns:wp14="http://schemas.microsoft.com/office/word/2010/wordprocessingDrawing" xmlns:wp="http://schemas.openxmlformats.org/drawingml/2006/wordprocessingDrawing" xmlns:w10="urn:schemas-microsoft-com:office:word" xmlns:w="http://schemas.openxmlformats.org/wordprocessingml/2006/main" xmlns:w14="http://schemas.microsoft.com/office/word/2010/wordml" xmlns:w15="http://schemas.microsoft.com/office/word/2012/wordml" xmlns:w16cex="http://schemas.microsoft.com/office/word/2018/wordml/cex" xmlns:w16cid="http://schemas.microsoft.com/office/word/2016/wordml/cid" xmlns:w16="http://schemas.microsoft.com/office/word/2018/wordml" xmlns:w16du="http://schemas.microsoft.com/office/word/2023/wordml/word16du" xmlns:w16sdtdh="http://schemas.microsoft.com/office/word/2020/wordml/sdtdatahash" xmlns:w16sdtfl="http://schemas.microsoft.com/office/word/2024/wordml/sdtformatlock" xmlns:w16se="http://schemas.microsoft.com/office/word/2015/wordml/symex" xmlns:wpg="http://schemas.microsoft.com/office/word/2010/wordprocessingGroup" xmlns:wpi="http://schemas.microsoft.com/office/word/2010/wordprocessingInk" xmlns:wne="http://schemas.microsoft.com/office/word/2006/wordml" xmlns:wps="http://schemas.microsoft.com/office/word/2010/wordprocessingShape" mc:Ignorable="w14 w15 w16se w16cid w16 w16cex w16sdtdh w16sdtfl w16du wp14">
   <w:body>
     <w:p>
       <w:r>
-        <w:t>These notes are generative AI garbage and needs to be viewed again and re-written by a human</w:t>
+        <w:t xml:space="preserve">These notes are generative AI garbage and </w:t>
+      </w:r>
+      <w:proofErr w:type="gramStart"/>
+      <w:r>
+        <w:t>needs</w:t>
+      </w:r>
+      <w:proofErr w:type="gramEnd"/>
+      <w:r>
+        <w:t xml:space="preserve"> to be viewed again and re-written by a human</w:t>
+      </w:r>
+      <w:r>
+        <w:t>:</w:t>
+      </w:r>
+      <w:r>
+        <w:t xml:space="preserve">    </w:t>
       </w:r>
     </w:p>
     <w:p>
@@ -463,7 +477,15 @@
         </w:numPr>
       </w:pPr>
       <w:r>
-        <w:t xml:space="preserve">Passkeys/passwordless authentication </w:t>
+        <w:t>Passkeys/</w:t>
+      </w:r>
+      <w:proofErr w:type="spellStart"/>
+      <w:r>
+        <w:t>passwordless</w:t>
+      </w:r>
+      <w:proofErr w:type="spellEnd"/>
+      <w:r>
+        <w:t xml:space="preserve"> authentication </w:t>
       </w:r>
     </w:p>
     <w:p>
@@ -1187,30 +1209,36 @@
       </w:r>
     </w:p>
     <w:p>
+      <w:proofErr w:type="spellStart"/>
       <w:proofErr w:type="gramStart"/>
       <w:r>
         <w:t>custom:department</w:t>
       </w:r>
+      <w:proofErr w:type="spellEnd"/>
       <w:proofErr w:type="gramEnd"/>
       <w:r>
         <w:t xml:space="preserve"> = engineering</w:t>
       </w:r>
     </w:p>
     <w:p>
+      <w:proofErr w:type="spellStart"/>
       <w:proofErr w:type="gramStart"/>
       <w:r>
         <w:t>custom:employeeId</w:t>
       </w:r>
+      <w:proofErr w:type="spellEnd"/>
       <w:proofErr w:type="gramEnd"/>
       <w:r>
         <w:t xml:space="preserve"> = 12345</w:t>
       </w:r>
     </w:p>
     <w:p>
+      <w:proofErr w:type="spellStart"/>
       <w:proofErr w:type="gramStart"/>
       <w:r>
         <w:t>custom:subscription</w:t>
       </w:r>
+      <w:proofErr w:type="spellEnd"/>
       <w:proofErr w:type="gramEnd"/>
       <w:r>
         <w:t xml:space="preserve"> = premium</w:t>
@@ -1520,13 +1548,18 @@
       <w:r>
         <w:t xml:space="preserve">  "</w:t>
       </w:r>
+      <w:proofErr w:type="spellStart"/>
       <w:proofErr w:type="gramStart"/>
       <w:r>
         <w:t>email</w:t>
       </w:r>
       <w:proofErr w:type="gramEnd"/>
       <w:r>
-        <w:t>_verified": true</w:t>
+        <w:t>_verified</w:t>
+      </w:r>
+      <w:proofErr w:type="spellEnd"/>
+      <w:r>
+        <w:t>": true</w:t>
       </w:r>
     </w:p>
     <w:p>
@@ -1602,8 +1635,13 @@
     </w:p>
     <w:p>
       <w:r>
-        <w:t xml:space="preserve">    openid</w:t>
-      </w:r>
+        <w:t xml:space="preserve">    </w:t>
+      </w:r>
+      <w:proofErr w:type="spellStart"/>
+      <w:r>
+        <w:t>openid</w:t>
+      </w:r>
+      <w:proofErr w:type="spellEnd"/>
     </w:p>
     <w:p>
       <w:r>
@@ -1643,7 +1681,15 @@
     </w:p>
     <w:p>
       <w:r>
-        <w:t>Bearer eyJ...</w:t>
+        <w:t xml:space="preserve">Bearer </w:t>
+      </w:r>
+      <w:proofErr w:type="spellStart"/>
+      <w:r>
+        <w:t>eyJ</w:t>
+      </w:r>
+      <w:proofErr w:type="spellEnd"/>
+      <w:r>
+        <w:t>...</w:t>
       </w:r>
     </w:p>
     <w:p>
@@ -1828,6 +1874,7 @@
       </w:r>
     </w:p>
     <w:p>
+      <w:proofErr w:type="spellStart"/>
       <w:proofErr w:type="gramStart"/>
       <w:r>
         <w:t>xxxxx.yyyyy</w:t>
@@ -1836,6 +1883,7 @@
       <w:r>
         <w:t>.zzzzz</w:t>
       </w:r>
+      <w:proofErr w:type="spellEnd"/>
     </w:p>
     <w:p>
       <w:r>
@@ -1880,25 +1928,46 @@
     </w:p>
     <w:p>
       <w:r>
-        <w:t xml:space="preserve">  "iss": "https://cognito-idp.eu-central-1.amazonaws.com/...",</w:t>
-      </w:r>
-    </w:p>
-    <w:p>
-      <w:r>
         <w:t xml:space="preserve">  "</w:t>
       </w:r>
+      <w:proofErr w:type="spellStart"/>
+      <w:r>
+        <w:t>iss</w:t>
+      </w:r>
+      <w:proofErr w:type="spellEnd"/>
+      <w:r>
+        <w:t>": "https://cognito-idp.eu-central-1.amazonaws.com/...",</w:t>
+      </w:r>
+    </w:p>
+    <w:p>
+      <w:r>
+        <w:t xml:space="preserve">  "</w:t>
+      </w:r>
+      <w:proofErr w:type="spellStart"/>
       <w:proofErr w:type="gramStart"/>
       <w:r>
         <w:t>client</w:t>
       </w:r>
       <w:proofErr w:type="gramEnd"/>
       <w:r>
-        <w:t>_id": "...",</w:t>
-      </w:r>
-    </w:p>
-    <w:p>
-      <w:r>
-        <w:t xml:space="preserve">  "username": "alice",</w:t>
+        <w:t>_id</w:t>
+      </w:r>
+      <w:proofErr w:type="spellEnd"/>
+      <w:r>
+        <w:t>": "...",</w:t>
+      </w:r>
+    </w:p>
+    <w:p>
+      <w:r>
+        <w:t xml:space="preserve">  "username": "</w:t>
+      </w:r>
+      <w:proofErr w:type="spellStart"/>
+      <w:r>
+        <w:t>alice</w:t>
+      </w:r>
+      <w:proofErr w:type="spellEnd"/>
+      <w:r>
+        <w:t>",</w:t>
       </w:r>
     </w:p>
     <w:p>
@@ -1908,7 +1977,15 @@
     </w:p>
     <w:p>
       <w:r>
-        <w:t xml:space="preserve">  "scope": "openid email"</w:t>
+        <w:t xml:space="preserve">  "scope": "</w:t>
+      </w:r>
+      <w:proofErr w:type="spellStart"/>
+      <w:r>
+        <w:t>openid</w:t>
+      </w:r>
+      <w:proofErr w:type="spellEnd"/>
+      <w:r>
+        <w:t xml:space="preserve"> email"</w:t>
       </w:r>
     </w:p>
     <w:p>
@@ -2105,9 +2182,11 @@
       </w:r>
     </w:p>
     <w:p>
+      <w:proofErr w:type="spellStart"/>
       <w:r>
         <w:t>phone_number</w:t>
       </w:r>
+      <w:proofErr w:type="spellEnd"/>
     </w:p>
     <w:p>
       <w:pPr>
@@ -2374,8 +2453,13 @@
     </w:p>
     <w:p>
       <w:r>
-        <w:t xml:space="preserve">    MyCompanyUsers</w:t>
-      </w:r>
+        <w:t xml:space="preserve">    </w:t>
+      </w:r>
+      <w:proofErr w:type="spellStart"/>
+      <w:r>
+        <w:t>MyCompanyUsers</w:t>
+      </w:r>
+      <w:proofErr w:type="spellEnd"/>
     </w:p>
     <w:p/>
     <w:p>
@@ -2385,13 +2469,23 @@
     </w:p>
     <w:p>
       <w:r>
-        <w:t xml:space="preserve">    WebApplication</w:t>
-      </w:r>
-    </w:p>
-    <w:p>
-      <w:r>
-        <w:t xml:space="preserve">    MobileApplication</w:t>
-      </w:r>
+        <w:t xml:space="preserve">    </w:t>
+      </w:r>
+      <w:proofErr w:type="spellStart"/>
+      <w:r>
+        <w:t>WebApplication</w:t>
+      </w:r>
+      <w:proofErr w:type="spellEnd"/>
+    </w:p>
+    <w:p>
+      <w:r>
+        <w:t xml:space="preserve">    </w:t>
+      </w:r>
+      <w:proofErr w:type="spellStart"/>
+      <w:r>
+        <w:t>MobileApplication</w:t>
+      </w:r>
+      <w:proofErr w:type="spellEnd"/>
     </w:p>
     <w:p>
       <w:r>
@@ -3315,9 +3409,11 @@
       </w:r>
     </w:p>
     <w:p>
+      <w:proofErr w:type="spellStart"/>
       <w:r>
         <w:t>Keycloak</w:t>
       </w:r>
+      <w:proofErr w:type="spellEnd"/>
     </w:p>
     <w:p>
       <w:r>
@@ -4053,13 +4149,20 @@
       </w:r>
     </w:p>
     <w:p>
+      <w:proofErr w:type="spellStart"/>
       <w:r>
         <w:t>token_use</w:t>
       </w:r>
-    </w:p>
-    <w:p>
-      <w:r>
-        <w:t>client_id / audience</w:t>
+      <w:proofErr w:type="spellEnd"/>
+    </w:p>
+    <w:p>
+      <w:proofErr w:type="spellStart"/>
+      <w:r>
+        <w:t>client_id</w:t>
+      </w:r>
+      <w:proofErr w:type="spellEnd"/>
+      <w:r>
+        <w:t xml:space="preserve"> / audience</w:t>
       </w:r>
     </w:p>
     <w:p>
@@ -4215,7 +4318,15 @@
     </w:p>
     <w:p>
       <w:r>
-        <w:t>You can use Amplify's UI components rather than building authentication screens from scratch.</w:t>
+        <w:t xml:space="preserve">You can use </w:t>
+      </w:r>
+      <w:proofErr w:type="spellStart"/>
+      <w:r>
+        <w:t>Amplify's</w:t>
+      </w:r>
+      <w:proofErr w:type="spellEnd"/>
+      <w:r>
+        <w:t xml:space="preserve"> UI components rather than building authentication screens from scratch.</w:t>
       </w:r>
     </w:p>
     <w:p>
@@ -4562,70 +4673,96 @@
       </w:r>
     </w:p>
     <w:p>
+      <w:proofErr w:type="spellStart"/>
       <w:r>
         <w:t>CreateUserPool</w:t>
       </w:r>
-    </w:p>
-    <w:p>
+      <w:proofErr w:type="spellEnd"/>
+    </w:p>
+    <w:p>
+      <w:proofErr w:type="spellStart"/>
       <w:r>
         <w:t>CreateUserPoolClient</w:t>
       </w:r>
-    </w:p>
-    <w:p>
+      <w:proofErr w:type="spellEnd"/>
+    </w:p>
+    <w:p>
+      <w:proofErr w:type="spellStart"/>
       <w:r>
         <w:t>AdminCreateUser</w:t>
       </w:r>
-    </w:p>
-    <w:p>
+      <w:proofErr w:type="spellEnd"/>
+    </w:p>
+    <w:p>
+      <w:proofErr w:type="spellStart"/>
       <w:r>
         <w:t>AdminDeleteUser</w:t>
       </w:r>
-    </w:p>
-    <w:p>
+      <w:proofErr w:type="spellEnd"/>
+    </w:p>
+    <w:p>
+      <w:proofErr w:type="spellStart"/>
       <w:r>
         <w:t>AdminGetUser</w:t>
       </w:r>
-    </w:p>
-    <w:p>
+      <w:proofErr w:type="spellEnd"/>
+    </w:p>
+    <w:p>
+      <w:proofErr w:type="spellStart"/>
       <w:r>
         <w:t>AdminSetUserPassword</w:t>
       </w:r>
-    </w:p>
-    <w:p>
+      <w:proofErr w:type="spellEnd"/>
+    </w:p>
+    <w:p>
+      <w:proofErr w:type="spellStart"/>
       <w:r>
         <w:t>ListUsers</w:t>
       </w:r>
-    </w:p>
-    <w:p>
+      <w:proofErr w:type="spellEnd"/>
+    </w:p>
+    <w:p>
+      <w:proofErr w:type="spellStart"/>
       <w:r>
         <w:lastRenderedPageBreak/>
         <w:t>ForgotPassword</w:t>
       </w:r>
-    </w:p>
-    <w:p>
+      <w:proofErr w:type="spellEnd"/>
+    </w:p>
+    <w:p>
+      <w:proofErr w:type="spellStart"/>
       <w:r>
         <w:t>ConfirmForgotPassword</w:t>
       </w:r>
-    </w:p>
-    <w:p>
+      <w:proofErr w:type="spellEnd"/>
+    </w:p>
+    <w:p>
+      <w:proofErr w:type="spellStart"/>
       <w:r>
         <w:t>InitiateAuth</w:t>
       </w:r>
-    </w:p>
-    <w:p>
+      <w:proofErr w:type="spellEnd"/>
+    </w:p>
+    <w:p>
+      <w:proofErr w:type="spellStart"/>
       <w:r>
         <w:t>RespondToAuthChallenge</w:t>
       </w:r>
-    </w:p>
-    <w:p>
+      <w:proofErr w:type="spellEnd"/>
+    </w:p>
+    <w:p>
+      <w:proofErr w:type="spellStart"/>
       <w:r>
         <w:t>GetUser</w:t>
       </w:r>
-    </w:p>
-    <w:p>
+      <w:proofErr w:type="spellEnd"/>
+    </w:p>
+    <w:p>
+      <w:proofErr w:type="spellStart"/>
       <w:r>
         <w:t>UpdateUserAttributes</w:t>
       </w:r>
+      <w:proofErr w:type="spellEnd"/>
     </w:p>
     <w:p>
       <w:r>
@@ -5903,9 +6040,11 @@
     </w:p>
     <w:p/>
     <w:p>
+      <w:proofErr w:type="spellStart"/>
       <w:r>
         <w:t>CognitoAuthenticatedRole</w:t>
       </w:r>
+      <w:proofErr w:type="spellEnd"/>
     </w:p>
     <w:p>
       <w:r>
@@ -6096,8 +6235,13 @@
     </w:p>
     <w:p>
       <w:r>
-        <w:t xml:space="preserve">             users               users</w:t>
-      </w:r>
+        <w:t xml:space="preserve">             users               </w:t>
+      </w:r>
+      <w:proofErr w:type="spellStart"/>
+      <w:r>
+        <w:t>users</w:t>
+      </w:r>
+      <w:proofErr w:type="spellEnd"/>
     </w:p>
     <w:p>
       <w:r>
@@ -6155,9 +6299,11 @@
       </w:r>
     </w:p>
     <w:p>
+      <w:proofErr w:type="spellStart"/>
       <w:r>
         <w:t>AppAuthenticatedRole</w:t>
       </w:r>
+      <w:proofErr w:type="spellEnd"/>
     </w:p>
     <w:p>
       <w:r>
@@ -6481,8 +6627,13 @@
     </w:p>
     <w:p>
       <w:r>
-        <w:t>THEN role = EngineeringRole</w:t>
-      </w:r>
+        <w:t xml:space="preserve">THEN role = </w:t>
+      </w:r>
+      <w:proofErr w:type="spellStart"/>
+      <w:r>
+        <w:t>EngineeringRole</w:t>
+      </w:r>
+      <w:proofErr w:type="spellEnd"/>
     </w:p>
     <w:p>
       <w:r>
@@ -6496,8 +6647,13 @@
     </w:p>
     <w:p>
       <w:r>
-        <w:t>THEN role = FinanceRole</w:t>
-      </w:r>
+        <w:t xml:space="preserve">THEN role = </w:t>
+      </w:r>
+      <w:proofErr w:type="spellStart"/>
+      <w:r>
+        <w:t>FinanceRole</w:t>
+      </w:r>
+      <w:proofErr w:type="spellEnd"/>
     </w:p>
     <w:p>
       <w:r>
@@ -6520,10 +6676,12 @@
       </w:r>
     </w:p>
     <w:p>
+      <w:proofErr w:type="spellStart"/>
       <w:proofErr w:type="gramStart"/>
       <w:r>
         <w:t>EngineeringRole</w:t>
       </w:r>
+      <w:proofErr w:type="spellEnd"/>
       <w:proofErr w:type="gramEnd"/>
     </w:p>
     <w:p/>
@@ -6543,10 +6701,12 @@
       </w:r>
     </w:p>
     <w:p>
+      <w:proofErr w:type="spellStart"/>
       <w:proofErr w:type="gramStart"/>
       <w:r>
         <w:t>FinanceRole</w:t>
       </w:r>
+      <w:proofErr w:type="spellEnd"/>
       <w:proofErr w:type="gramEnd"/>
     </w:p>
     <w:p>
@@ -6615,10 +6775,12 @@
       <w:r>
         <w:t xml:space="preserve">    │ </w:t>
       </w:r>
+      <w:proofErr w:type="spellStart"/>
       <w:proofErr w:type="gramStart"/>
       <w:r>
         <w:t>cognito:groups</w:t>
       </w:r>
+      <w:proofErr w:type="spellEnd"/>
       <w:proofErr w:type="gramEnd"/>
     </w:p>
     <w:p>
@@ -6779,9 +6941,11 @@
       </w:r>
     </w:p>
     <w:p>
+      <w:proofErr w:type="spellStart"/>
       <w:r>
         <w:t>AdminRole</w:t>
       </w:r>
+      <w:proofErr w:type="spellEnd"/>
     </w:p>
     <w:p/>
     <w:p>
@@ -6795,9 +6959,11 @@
       </w:r>
     </w:p>
     <w:p>
+      <w:proofErr w:type="spellStart"/>
       <w:r>
         <w:t>DeveloperRole</w:t>
       </w:r>
+      <w:proofErr w:type="spellEnd"/>
     </w:p>
     <w:p/>
     <w:p>
@@ -6811,9 +6977,11 @@
       </w:r>
     </w:p>
     <w:p>
+      <w:proofErr w:type="spellStart"/>
       <w:r>
         <w:t>CustomerRole</w:t>
       </w:r>
+      <w:proofErr w:type="spellEnd"/>
     </w:p>
     <w:p>
       <w:r>
@@ -6822,13 +6990,23 @@
     </w:p>
     <w:p>
       <w:r>
-        <w:t>Alice → DeveloperRole</w:t>
-      </w:r>
-    </w:p>
-    <w:p>
-      <w:r>
-        <w:t>Bob   → AdminRole</w:t>
-      </w:r>
+        <w:t xml:space="preserve">Alice → </w:t>
+      </w:r>
+      <w:proofErr w:type="spellStart"/>
+      <w:r>
+        <w:t>DeveloperRole</w:t>
+      </w:r>
+      <w:proofErr w:type="spellEnd"/>
+    </w:p>
+    <w:p>
+      <w:r>
+        <w:t xml:space="preserve">Bob   → </w:t>
+      </w:r>
+      <w:proofErr w:type="spellStart"/>
+      <w:r>
+        <w:t>AdminRole</w:t>
+      </w:r>
+      <w:proofErr w:type="spellEnd"/>
     </w:p>
     <w:p>
       <w:r>
@@ -6974,8 +7152,13 @@
     </w:p>
     <w:p>
       <w:r>
-        <w:t xml:space="preserve">                   │ AssumeRoleWithWebIdentity</w:t>
-      </w:r>
+        <w:t xml:space="preserve">                   │ </w:t>
+      </w:r>
+      <w:proofErr w:type="spellStart"/>
+      <w:r>
+        <w:t>AssumeRoleWithWebIdentity</w:t>
+      </w:r>
+      <w:proofErr w:type="spellEnd"/>
     </w:p>
     <w:p>
       <w:r>
@@ -7320,8 +7503,13 @@
     </w:p>
     <w:p>
       <w:r>
-        <w:t xml:space="preserve">    DeveloperRole</w:t>
-      </w:r>
+        <w:t xml:space="preserve">    </w:t>
+      </w:r>
+      <w:proofErr w:type="spellStart"/>
+      <w:r>
+        <w:t>DeveloperRole</w:t>
+      </w:r>
+      <w:proofErr w:type="spellEnd"/>
     </w:p>
     <w:p/>
     <w:p>
@@ -7536,10 +7724,12 @@
       <w:proofErr w:type="gramEnd"/>
     </w:p>
     <w:p>
+      <w:proofErr w:type="spellStart"/>
       <w:proofErr w:type="gramStart"/>
       <w:r>
         <w:t>dynamodb:PutItem</w:t>
       </w:r>
+      <w:proofErr w:type="spellEnd"/>
       <w:proofErr w:type="gramEnd"/>
     </w:p>
     <w:p>
@@ -8331,10 +8521,12 @@
       <w:r>
         <w:t xml:space="preserve">  "</w:t>
       </w:r>
+      <w:proofErr w:type="spellStart"/>
       <w:proofErr w:type="gramStart"/>
       <w:r>
         <w:t>custom:department</w:t>
       </w:r>
+      <w:proofErr w:type="spellEnd"/>
       <w:proofErr w:type="gramEnd"/>
       <w:r>
         <w:t>": "engineering",</w:t>
@@ -8344,10 +8536,12 @@
       <w:r>
         <w:t xml:space="preserve">  "</w:t>
       </w:r>
+      <w:proofErr w:type="spellStart"/>
       <w:proofErr w:type="gramStart"/>
       <w:r>
         <w:t>custom:tier</w:t>
       </w:r>
+      <w:proofErr w:type="spellEnd"/>
       <w:proofErr w:type="gramEnd"/>
       <w:r>
         <w:t>": "premium"</w:t>
@@ -8966,12 +9160,28 @@
     </w:p>
     <w:p>
       <w:r>
-        <w:t>const accessKey = "...";</w:t>
-      </w:r>
-    </w:p>
-    <w:p>
-      <w:r>
-        <w:t>const secretKey = "...";</w:t>
+        <w:t xml:space="preserve">const </w:t>
+      </w:r>
+      <w:proofErr w:type="spellStart"/>
+      <w:r>
+        <w:t>accessKey</w:t>
+      </w:r>
+      <w:proofErr w:type="spellEnd"/>
+      <w:r>
+        <w:t xml:space="preserve"> = "...";</w:t>
+      </w:r>
+    </w:p>
+    <w:p>
+      <w:r>
+        <w:t xml:space="preserve">const </w:t>
+      </w:r>
+      <w:proofErr w:type="spellStart"/>
+      <w:r>
+        <w:t>secretKey</w:t>
+      </w:r>
+      <w:proofErr w:type="spellEnd"/>
+      <w:r>
+        <w:t xml:space="preserve"> = "...";</w:t>
       </w:r>
     </w:p>
     <w:p>
@@ -9860,7 +10070,15 @@
     </w:p>
     <w:p>
       <w:r>
-        <w:t>S3 presigned URL</w:t>
+        <w:t xml:space="preserve">S3 </w:t>
+      </w:r>
+      <w:proofErr w:type="spellStart"/>
+      <w:r>
+        <w:t>presigned</w:t>
+      </w:r>
+      <w:proofErr w:type="spellEnd"/>
+      <w:r>
+        <w:t xml:space="preserve"> URL</w:t>
       </w:r>
     </w:p>
     <w:p>
@@ -11470,20 +11688,26 @@
       </w:r>
     </w:p>
     <w:p>
+      <w:proofErr w:type="spellStart"/>
       <w:r>
         <w:lastRenderedPageBreak/>
         <w:t>AccessKeyId</w:t>
       </w:r>
-    </w:p>
-    <w:p>
+      <w:proofErr w:type="spellEnd"/>
+    </w:p>
+    <w:p>
+      <w:proofErr w:type="spellStart"/>
       <w:r>
         <w:t>SecretAccessKey</w:t>
       </w:r>
-    </w:p>
-    <w:p>
+      <w:proofErr w:type="spellEnd"/>
+    </w:p>
+    <w:p>
+      <w:proofErr w:type="spellStart"/>
       <w:r>
         <w:t>SessionToken</w:t>
       </w:r>
+      <w:proofErr w:type="spellEnd"/>
     </w:p>
     <w:p>
       <w:r>
@@ -11568,21 +11792,27 @@
       </w:r>
     </w:p>
     <w:p>
+      <w:proofErr w:type="spellStart"/>
       <w:r>
         <w:t>DeveloperRole</w:t>
       </w:r>
-    </w:p>
-    <w:p>
+      <w:proofErr w:type="spellEnd"/>
+    </w:p>
+    <w:p>
+      <w:proofErr w:type="spellStart"/>
       <w:proofErr w:type="gramStart"/>
       <w:r>
         <w:t>FinanceRole</w:t>
       </w:r>
+      <w:proofErr w:type="spellEnd"/>
       <w:proofErr w:type="gramEnd"/>
     </w:p>
     <w:p>
+      <w:proofErr w:type="spellStart"/>
       <w:r>
         <w:t>AdminRole</w:t>
       </w:r>
+      <w:proofErr w:type="spellEnd"/>
     </w:p>
     <w:p>
       <w:r>
@@ -11590,9 +11820,11 @@
       </w:r>
     </w:p>
     <w:p>
+      <w:proofErr w:type="spellStart"/>
       <w:r>
         <w:t>DeveloperRole</w:t>
       </w:r>
+      <w:proofErr w:type="spellEnd"/>
     </w:p>
     <w:p>
       <w:r>
@@ -11606,10 +11838,12 @@
     </w:p>
     <w:p/>
     <w:p>
+      <w:proofErr w:type="spellStart"/>
       <w:proofErr w:type="gramStart"/>
       <w:r>
         <w:t>FinanceRole</w:t>
       </w:r>
+      <w:proofErr w:type="spellEnd"/>
       <w:proofErr w:type="gramEnd"/>
     </w:p>
     <w:p>
@@ -11625,9 +11859,11 @@
     </w:p>
     <w:p/>
     <w:p>
+      <w:proofErr w:type="spellStart"/>
       <w:r>
         <w:t>AdminRole</w:t>
       </w:r>
+      <w:proofErr w:type="spellEnd"/>
     </w:p>
     <w:p>
       <w:r>
@@ -11695,9 +11931,11 @@
       </w:r>
     </w:p>
     <w:p>
+      <w:proofErr w:type="spellStart"/>
       <w:r>
         <w:t>DeveloperRole</w:t>
       </w:r>
+      <w:proofErr w:type="spellEnd"/>
     </w:p>
     <w:p>
       <w:r>
@@ -11753,19 +11991,34 @@
     </w:p>
     <w:p>
       <w:r>
-        <w:t>engineering → EngineeringRole</w:t>
-      </w:r>
-    </w:p>
-    <w:p>
-      <w:r>
-        <w:t>finance     → FinanceRole</w:t>
-      </w:r>
+        <w:t xml:space="preserve">engineering → </w:t>
+      </w:r>
+      <w:proofErr w:type="spellStart"/>
+      <w:r>
+        <w:t>EngineeringRole</w:t>
+      </w:r>
+      <w:proofErr w:type="spellEnd"/>
+    </w:p>
+    <w:p>
+      <w:r>
+        <w:t xml:space="preserve">finance     → </w:t>
+      </w:r>
+      <w:proofErr w:type="spellStart"/>
+      <w:r>
+        <w:t>FinanceRole</w:t>
+      </w:r>
+      <w:proofErr w:type="spellEnd"/>
     </w:p>
     <w:p>
       <w:r>
         <w:lastRenderedPageBreak/>
-        <w:t>support     → SupportRole</w:t>
-      </w:r>
+        <w:t xml:space="preserve">support     → </w:t>
+      </w:r>
+      <w:proofErr w:type="spellStart"/>
+      <w:r>
+        <w:t>SupportRole</w:t>
+      </w:r>
+      <w:proofErr w:type="spellEnd"/>
     </w:p>
     <w:p>
       <w:r>
@@ -12042,8 +12295,21 @@
     </w:p>
     <w:p>
       <w:r>
-        <w:t xml:space="preserve">     Lambda         Lambda           Lambda</w:t>
-      </w:r>
+        <w:t xml:space="preserve">     Lambda         </w:t>
+      </w:r>
+      <w:proofErr w:type="spellStart"/>
+      <w:r>
+        <w:t>Lambda</w:t>
+      </w:r>
+      <w:proofErr w:type="spellEnd"/>
+      <w:r>
+        <w:t xml:space="preserve">           </w:t>
+      </w:r>
+      <w:proofErr w:type="spellStart"/>
+      <w:r>
+        <w:t>Lambda</w:t>
+      </w:r>
+      <w:proofErr w:type="spellEnd"/>
     </w:p>
     <w:p>
       <w:r>
@@ -12220,8 +12486,13 @@
         <w:t>──</w:t>
       </w:r>
       <w:r>
-        <w:t xml:space="preserve"> tenantId</w:t>
-      </w:r>
+        <w:t xml:space="preserve"> </w:t>
+      </w:r>
+      <w:proofErr w:type="spellStart"/>
+      <w:r>
+        <w:t>tenantId</w:t>
+      </w:r>
+      <w:proofErr w:type="spellEnd"/>
     </w:p>
     <w:p>
       <w:r>
@@ -12372,9 +12643,11 @@
       </w:r>
     </w:p>
     <w:p>
+      <w:proofErr w:type="spellStart"/>
       <w:r>
         <w:t>tenantId</w:t>
       </w:r>
+      <w:proofErr w:type="spellEnd"/>
     </w:p>
     <w:p>
       <w:r>
@@ -12388,8 +12661,13 @@
       </w:r>
     </w:p>
     <w:p>
-      <w:r>
-        <w:t>tenantId = company-a</w:t>
+      <w:proofErr w:type="spellStart"/>
+      <w:r>
+        <w:t>tenantId</w:t>
+      </w:r>
+      <w:proofErr w:type="spellEnd"/>
+      <w:r>
+        <w:t xml:space="preserve"> = company-a</w:t>
       </w:r>
     </w:p>
     <w:p/>
@@ -12399,8 +12677,13 @@
       </w:r>
     </w:p>
     <w:p>
-      <w:r>
-        <w:t>tenantId = company-b</w:t>
+      <w:proofErr w:type="spellStart"/>
+      <w:r>
+        <w:t>tenantId</w:t>
+      </w:r>
+      <w:proofErr w:type="spellEnd"/>
+      <w:r>
+        <w:t xml:space="preserve"> = company-b</w:t>
       </w:r>
     </w:p>
     <w:p>
@@ -12420,7 +12703,15 @@
     </w:p>
     <w:p>
       <w:r>
-        <w:t>WHERE tenantId = company-a</w:t>
+        <w:t xml:space="preserve">WHERE </w:t>
+      </w:r>
+      <w:proofErr w:type="spellStart"/>
+      <w:r>
+        <w:t>tenantId</w:t>
+      </w:r>
+      <w:proofErr w:type="spellEnd"/>
+      <w:r>
+        <w:t xml:space="preserve"> = company-a</w:t>
       </w:r>
     </w:p>
     <w:p>
@@ -14751,7 +15042,7 @@
 </file>
 
 <file path=word/numbering.xml><?xml version="1.0" encoding="utf-8"?>
-<w:numbering xmlns:wpc="http://schemas.microsoft.com/office/word/2010/wordprocessingCanvas" xmlns:cx="http://schemas.microsoft.com/office/drawing/2014/chartex" xmlns:cx1="http://schemas.microsoft.com/office/drawing/2015/9/8/chartex" xmlns:cx2="http://schemas.microsoft.com/office/drawing/2015/10/21/chartex" xmlns:cx3="http://schemas.microsoft.com/office/drawing/2016/5/9/chartex" xmlns:cx4="http://schemas.microsoft.com/office/drawing/2016/5/10/chartex" xmlns:cx5="http://schemas.microsoft.com/office/drawing/2016/5/11/chartex" xmlns:cx6="http://schemas.microsoft.com/office/drawing/2016/5/12/chartex" xmlns:cx7="http://schemas.microsoft.com/office/drawing/2016/5/13/chartex" xmlns:cx8="http://schemas.microsoft.com/office/drawing/2016/5/14/chartex" xmlns:mc="http://schemas.openxmlformats.org/markup-compatibility/2006" xmlns:aink="http://schemas.microsoft.com/office/drawing/2016/ink" xmlns:am3d="http://schemas.microsoft.com/office/drawing/2017/model3d" xmlns:o="urn:schemas-microsoft-com:office:office" xmlns:oel="http://schemas.microsoft.com/office/2019/extlst" xmlns:r="http://schemas.openxmlformats.org/officeDocument/2006/relationships" xmlns:m="http://schemas.openxmlformats.org/officeDocument/2006/math" xmlns:v="urn:schemas-microsoft-com:vml" xmlns:wp14="http://schemas.microsoft.com/office/word/2010/wordprocessingDrawing" xmlns:wp="http://schemas.openxmlformats.org/drawingml/2006/wordprocessingDrawing" xmlns:w10="urn:schemas-microsoft-com:office:word" xmlns:w="http://schemas.openxmlformats.org/wordprocessingml/2006/main" xmlns:w14="http://schemas.microsoft.com/office/word/2010/wordml" xmlns:w15="http://schemas.microsoft.com/office/word/2012/wordml" xmlns:w16cei="http://schemas.microsoft.com/office/word/2026/wordml/cei" xmlns:w16cex="http://schemas.microsoft.com/office/word/2018/wordml/cex" xmlns:w16cid="http://schemas.microsoft.com/office/word/2016/wordml/cid" xmlns:w16="http://schemas.microsoft.com/office/word/2018/wordml" xmlns:w16du="http://schemas.microsoft.com/office/word/2023/wordml/word16du" xmlns:w16sdtdh="http://schemas.microsoft.com/office/word/2020/wordml/sdtdatahash" xmlns:w16sdtfl="http://schemas.microsoft.com/office/word/2024/wordml/sdtformatlock" xmlns:w16se="http://schemas.microsoft.com/office/word/2015/wordml/symex" xmlns:wpg="http://schemas.microsoft.com/office/word/2010/wordprocessingGroup" xmlns:wpi="http://schemas.microsoft.com/office/word/2010/wordprocessingInk" xmlns:wne="http://schemas.microsoft.com/office/word/2006/wordml" xmlns:wps="http://schemas.microsoft.com/office/word/2010/wordprocessingShape" mc:Ignorable="w14 w15 w16se w16cid w16 w16cex w16sdtdh w16sdtfl w16du wp14">
+<w:numbering xmlns:wpc="http://schemas.microsoft.com/office/word/2010/wordprocessingCanvas" xmlns:cx="http://schemas.microsoft.com/office/drawing/2014/chartex" xmlns:cx1="http://schemas.microsoft.com/office/drawing/2015/9/8/chartex" xmlns:cx2="http://schemas.microsoft.com/office/drawing/2015/10/21/chartex" xmlns:cx3="http://schemas.microsoft.com/office/drawing/2016/5/9/chartex" xmlns:cx4="http://schemas.microsoft.com/office/drawing/2016/5/10/chartex" xmlns:cx5="http://schemas.microsoft.com/office/drawing/2016/5/11/chartex" xmlns:cx6="http://schemas.microsoft.com/office/drawing/2016/5/12/chartex" xmlns:cx7="http://schemas.microsoft.com/office/drawing/2016/5/13/chartex" xmlns:cx8="http://schemas.microsoft.com/office/drawing/2016/5/14/chartex" xmlns:mc="http://schemas.openxmlformats.org/markup-compatibility/2006" xmlns:aink="http://schemas.microsoft.com/office/drawing/2016/ink" xmlns:am3d="http://schemas.microsoft.com/office/drawing/2017/model3d" xmlns:o="urn:schemas-microsoft-com:office:office" xmlns:oel="http://schemas.microsoft.com/office/2019/extlst" xmlns:r="http://schemas.openxmlformats.org/officeDocument/2006/relationships" xmlns:m="http://schemas.openxmlformats.org/officeDocument/2006/math" xmlns:v="urn:schemas-microsoft-com:vml" xmlns:wp14="http://schemas.microsoft.com/office/word/2010/wordprocessingDrawing" xmlns:wp="http://schemas.openxmlformats.org/drawingml/2006/wordprocessingDrawing" xmlns:w10="urn:schemas-microsoft-com:office:word" xmlns:w="http://schemas.openxmlformats.org/wordprocessingml/2006/main" xmlns:w14="http://schemas.microsoft.com/office/word/2010/wordml" xmlns:w15="http://schemas.microsoft.com/office/word/2012/wordml" xmlns:w16cex="http://schemas.microsoft.com/office/word/2018/wordml/cex" xmlns:w16cid="http://schemas.microsoft.com/office/word/2016/wordml/cid" xmlns:w16="http://schemas.microsoft.com/office/word/2018/wordml" xmlns:w16du="http://schemas.microsoft.com/office/word/2023/wordml/word16du" xmlns:w16sdtdh="http://schemas.microsoft.com/office/word/2020/wordml/sdtdatahash" xmlns:w16sdtfl="http://schemas.microsoft.com/office/word/2024/wordml/sdtformatlock" xmlns:w16se="http://schemas.microsoft.com/office/word/2015/wordml/symex" xmlns:wpg="http://schemas.microsoft.com/office/word/2010/wordprocessingGroup" xmlns:wpi="http://schemas.microsoft.com/office/word/2010/wordprocessingInk" xmlns:wne="http://schemas.microsoft.com/office/word/2006/wordml" xmlns:wps="http://schemas.microsoft.com/office/word/2010/wordprocessingShape" mc:Ignorable="w14 w15 w16se w16cid w16 w16cex w16sdtdh w16sdtfl w16du wp14">
   <w:abstractNum w:abstractNumId="0" w15:restartNumberingAfterBreak="0">
     <w:nsid w:val="056368AB"/>
     <w:multiLevelType w:val="multilevel"/>

</xml_diff>